<commit_message>
Build out Errors and Noise section per instruction spec
Fully builds docs/07-error-correction/errors-and-noise.md per
context_docs/ErrorsAndNoiseInstruction.docx: noise-vs-error framing,
an interactive bit-flip (X) toggle, a mini Bloch-sphere phase-flip (Z)
demo, a brief Y-error summary, a randomized "identify the error"
guessing game (X/Z/Y), a bridge back to the 3-qubit repetition-code
example showing it catches bit flips but not phase flips, and a
"going deeper" aside on general Pauli errors and hardware noise
sources. Adds a shared noise color token and pill/feedback CSS
primitives so later QEC demos can reuse the same visual language.

Co-Authored-By: Claude Sonnet 5 <noreply@anthropic.com>
</commit_message>
<xml_diff>
--- a/context_docs/PhysicalVsLogicalQubitsInstruction.docx
+++ b/context_docs/PhysicalVsLogicalQubitsInstruction.docx
@@ -51,22 +51,10 @@
           <w:b/>
           <w:bCs/>
         </w:rPr>
-        <w:t xml:space="preserve">logical </w:t>
-      </w:r>
-      <w:proofErr w:type="gramStart"/>
-      <w:r>
-        <w:rPr>
-          <w:b/>
-          <w:bCs/>
-        </w:rPr>
-        <w:t>qubits</w:t>
-      </w:r>
-      <w:r>
-        <w:t>, and</w:t>
-      </w:r>
-      <w:proofErr w:type="gramEnd"/>
-      <w:r>
-        <w:t xml:space="preserve"> introduces the idea that a logical qubit can be encoded across multiple physical qubits for error protection.</w:t>
+        <w:t>logical qubits</w:t>
+      </w:r>
+      <w:r>
+        <w:t>, and introduces the idea that a logical qubit can be encoded across multiple physical qubits for error protection.</w:t>
       </w:r>
     </w:p>
     <w:p>
@@ -134,15 +122,7 @@
         </w:numPr>
       </w:pPr>
       <w:r>
-        <w:t xml:space="preserve">Why </w:t>
-      </w:r>
-      <w:proofErr w:type="gramStart"/>
-      <w:r>
-        <w:t>a logical qubit can</w:t>
-      </w:r>
-      <w:proofErr w:type="gramEnd"/>
-      <w:r>
-        <w:t xml:space="preserve"> require multiple physical qubits.</w:t>
+        <w:t>Why a logical qubit can require multiple physical qubits.</w:t>
       </w:r>
     </w:p>
     <w:p>
@@ -163,13 +143,8 @@
           <w:numId w:val="1"/>
         </w:numPr>
       </w:pPr>
-      <w:proofErr w:type="gramStart"/>
-      <w:r>
-        <w:t>That physical</w:t>
-      </w:r>
-      <w:proofErr w:type="gramEnd"/>
-      <w:r>
-        <w:t xml:space="preserve"> qubits are susceptible to errors, while logical qubits can be designed to be more robust against those errors.</w:t>
+      <w:r>
+        <w:t>That physical qubits are susceptible to errors, while logical qubits can be designed to be more robust against those errors.</w:t>
       </w:r>
     </w:p>
     <w:p>
@@ -605,23 +580,7 @@
           <w:b/>
           <w:bCs/>
         </w:rPr>
-        <w:t xml:space="preserve">5. Physical vs </w:t>
-      </w:r>
-      <w:proofErr w:type="gramStart"/>
-      <w:r>
-        <w:rPr>
-          <w:b/>
-          <w:bCs/>
-        </w:rPr>
-        <w:t>Logical</w:t>
-      </w:r>
-      <w:proofErr w:type="gramEnd"/>
-      <w:r>
-        <w:rPr>
-          <w:b/>
-          <w:bCs/>
-        </w:rPr>
-        <w:t xml:space="preserve"> comparison</w:t>
+        <w:t>5. Physical vs Logical comparison</w:t>
       </w:r>
     </w:p>
     <w:p>
@@ -864,23 +823,7 @@
           <w:b/>
           <w:bCs/>
         </w:rPr>
-        <w:t xml:space="preserve">Logical qubits are </w:t>
-      </w:r>
-      <w:proofErr w:type="gramStart"/>
-      <w:r>
-        <w:rPr>
-          <w:b/>
-          <w:bCs/>
-        </w:rPr>
-        <w:t>encoded</w:t>
-      </w:r>
-      <w:proofErr w:type="gramEnd"/>
-      <w:r>
-        <w:rPr>
-          <w:b/>
-          <w:bCs/>
-        </w:rPr>
-        <w:t xml:space="preserve"> quantum information.</w:t>
+        <w:t>Logical qubits are encoded quantum information.</w:t>
       </w:r>
     </w:p>
     <w:p>
@@ -1083,15 +1026,7 @@
         </w:numPr>
       </w:pPr>
       <w:r>
-        <w:t xml:space="preserve">Do not introduce a new UI framework or dependency unless </w:t>
-      </w:r>
-      <w:proofErr w:type="gramStart"/>
-      <w:r>
-        <w:t>absolutely necessary</w:t>
-      </w:r>
-      <w:proofErr w:type="gramEnd"/>
-      <w:r>
-        <w:t>.</w:t>
+        <w:t>Do not introduce a new UI framework or dependency unless absolutely necessary.</w:t>
       </w:r>
     </w:p>
     <w:p>
@@ -1179,15 +1114,7 @@
     </w:p>
     <w:p>
       <w:r>
-        <w:t xml:space="preserve">The purpose of this section is specifically to establish </w:t>
-      </w:r>
-      <w:proofErr w:type="gramStart"/>
-      <w:r>
-        <w:t>the conceptual</w:t>
-      </w:r>
-      <w:proofErr w:type="gramEnd"/>
-      <w:r>
-        <w:t xml:space="preserve"> relationship:</w:t>
+        <w:t>The purpose of this section is specifically to establish the conceptual relationship:</w:t>
       </w:r>
     </w:p>
     <w:p>
@@ -1202,15 +1129,7 @@
     </w:p>
     <w:p>
       <w:r>
-        <w:t xml:space="preserve">The learner should finish the </w:t>
-      </w:r>
-      <w:proofErr w:type="gramStart"/>
-      <w:r>
-        <w:t>page</w:t>
-      </w:r>
-      <w:proofErr w:type="gramEnd"/>
-      <w:r>
-        <w:t xml:space="preserve"> asking:</w:t>
+        <w:t>The learner should finish the page asking:</w:t>
       </w:r>
     </w:p>
     <w:p>
@@ -1223,6 +1142,160 @@
         <w:t>That question should naturally lead into the next section.</w:t>
       </w:r>
     </w:p>
+    <w:p/>
+    <w:p>
+      <w:pPr>
+        <w:rPr>
+          <w:b/>
+          <w:bCs/>
+        </w:rPr>
+      </w:pPr>
+      <w:r>
+        <w:rPr>
+          <w:b/>
+          <w:bCs/>
+        </w:rPr>
+        <w:t>Important: Clearly communicate the limits of the 3-qubit example</w:t>
+      </w:r>
+    </w:p>
+    <w:p>
+      <w:r>
+        <w:t>The 3-qubit repetition code is a deliberately simplified teaching example.</w:t>
+      </w:r>
+    </w:p>
+    <w:p>
+      <w:r>
+        <w:t xml:space="preserve">It should be presented as a code that can </w:t>
+      </w:r>
+      <w:r>
+        <w:rPr>
+          <w:b/>
+          <w:bCs/>
+        </w:rPr>
+        <w:t>correct a single bit-flip (X) error</w:t>
+      </w:r>
+      <w:r>
+        <w:t>, not as a complete solution to quantum errors.</w:t>
+      </w:r>
+    </w:p>
+    <w:p>
+      <w:r>
+        <w:t>The demo should explicitly distinguish:</w:t>
+      </w:r>
+    </w:p>
+    <w:p>
+      <w:pPr>
+        <w:numPr>
+          <w:ilvl w:val="0"/>
+          <w:numId w:val="6"/>
+        </w:numPr>
+      </w:pPr>
+      <w:r>
+        <w:t>No error → correct</w:t>
+      </w:r>
+    </w:p>
+    <w:p>
+      <w:pPr>
+        <w:numPr>
+          <w:ilvl w:val="0"/>
+          <w:numId w:val="6"/>
+        </w:numPr>
+      </w:pPr>
+      <w:r>
+        <w:t>One X error on q₁ → correct</w:t>
+      </w:r>
+    </w:p>
+    <w:p>
+      <w:pPr>
+        <w:numPr>
+          <w:ilvl w:val="0"/>
+          <w:numId w:val="6"/>
+        </w:numPr>
+      </w:pPr>
+      <w:r>
+        <w:t>One X error on q₂ → correct</w:t>
+      </w:r>
+    </w:p>
+    <w:p>
+      <w:pPr>
+        <w:numPr>
+          <w:ilvl w:val="0"/>
+          <w:numId w:val="6"/>
+        </w:numPr>
+      </w:pPr>
+      <w:r>
+        <w:t>One X error on q₃ → correct</w:t>
+      </w:r>
+    </w:p>
+    <w:p>
+      <w:pPr>
+        <w:numPr>
+          <w:ilvl w:val="0"/>
+          <w:numId w:val="6"/>
+        </w:numPr>
+      </w:pPr>
+      <w:r>
+        <w:t>Z/phase error → not corrected by this code</w:t>
+      </w:r>
+    </w:p>
+    <w:p>
+      <w:pPr>
+        <w:numPr>
+          <w:ilvl w:val="0"/>
+          <w:numId w:val="6"/>
+        </w:numPr>
+      </w:pPr>
+      <w:r>
+        <w:t>Y error → not fully protected by this code</w:t>
+      </w:r>
+    </w:p>
+    <w:p>
+      <w:pPr>
+        <w:numPr>
+          <w:ilvl w:val="0"/>
+          <w:numId w:val="6"/>
+        </w:numPr>
+      </w:pPr>
+      <w:r>
+        <w:t>Multiple simultaneous errors → generally outside the code's correction capability</w:t>
+      </w:r>
+    </w:p>
+    <w:p>
+      <w:r>
+        <w:t>Include a small "What this code cannot do" expandable panel.</w:t>
+      </w:r>
+    </w:p>
+    <w:p>
+      <w:r>
+        <w:t>Explain that the repetition code protects information encoded in the computational basis against bit flips, but does not independently protect against phase flips.</w:t>
+      </w:r>
+    </w:p>
+    <w:p>
+      <w:r>
+        <w:t>Use this as a transition into more general quantum error correction:</w:t>
+      </w:r>
+    </w:p>
+    <w:p>
+      <w:r>
+        <w:rPr>
+          <w:b/>
+          <w:bCs/>
+        </w:rPr>
+        <w:t>The 3-qubit repetition code teaches us the core idea of redundancy, but real quantum error correction must protect against both bit-flip and phase-flip errors.</w:t>
+      </w:r>
+    </w:p>
+    <w:p>
+      <w:r>
+        <w:t>Do not imply that three physical qubits are generally sufficient to create a fault-tolerant logical qubit.</w:t>
+      </w:r>
+    </w:p>
+    <w:p>
+      <w:r>
+        <w:lastRenderedPageBreak/>
+        <w:t>Also make clear that the 3-qubit encoding is being used here because it provides an intuitive introduction to encoding and error correction. More complete codes, such as CSS and surface codes, are introduced later in the module.</w:t>
+      </w:r>
+    </w:p>
+    <w:p/>
     <w:p/>
     <w:sectPr>
       <w:pgSz w:w="12240" w:h="15840"/>
@@ -1761,6 +1834,155 @@
     </w:lvl>
   </w:abstractNum>
   <w:abstractNum w:abstractNumId="4" w15:restartNumberingAfterBreak="0">
+    <w:nsid w:val="3B061717"/>
+    <w:multiLevelType w:val="multilevel"/>
+    <w:tmpl w:val="E16218BE"/>
+    <w:lvl w:ilvl="0">
+      <w:start w:val="1"/>
+      <w:numFmt w:val="bullet"/>
+      <w:lvlText w:val=""/>
+      <w:lvlJc w:val="left"/>
+      <w:pPr>
+        <w:tabs>
+          <w:tab w:val="num" w:pos="720"/>
+        </w:tabs>
+        <w:ind w:left="720" w:hanging="360"/>
+      </w:pPr>
+      <w:rPr>
+        <w:rFonts w:ascii="Symbol" w:hAnsi="Symbol" w:hint="default"/>
+        <w:sz w:val="20"/>
+      </w:rPr>
+    </w:lvl>
+    <w:lvl w:ilvl="1" w:tentative="1">
+      <w:start w:val="1"/>
+      <w:numFmt w:val="bullet"/>
+      <w:lvlText w:val="o"/>
+      <w:lvlJc w:val="left"/>
+      <w:pPr>
+        <w:tabs>
+          <w:tab w:val="num" w:pos="1440"/>
+        </w:tabs>
+        <w:ind w:left="1440" w:hanging="360"/>
+      </w:pPr>
+      <w:rPr>
+        <w:rFonts w:ascii="Courier New" w:hAnsi="Courier New" w:hint="default"/>
+        <w:sz w:val="20"/>
+      </w:rPr>
+    </w:lvl>
+    <w:lvl w:ilvl="2" w:tentative="1">
+      <w:start w:val="1"/>
+      <w:numFmt w:val="bullet"/>
+      <w:lvlText w:val=""/>
+      <w:lvlJc w:val="left"/>
+      <w:pPr>
+        <w:tabs>
+          <w:tab w:val="num" w:pos="2160"/>
+        </w:tabs>
+        <w:ind w:left="2160" w:hanging="360"/>
+      </w:pPr>
+      <w:rPr>
+        <w:rFonts w:ascii="Wingdings" w:hAnsi="Wingdings" w:hint="default"/>
+        <w:sz w:val="20"/>
+      </w:rPr>
+    </w:lvl>
+    <w:lvl w:ilvl="3" w:tentative="1">
+      <w:start w:val="1"/>
+      <w:numFmt w:val="bullet"/>
+      <w:lvlText w:val=""/>
+      <w:lvlJc w:val="left"/>
+      <w:pPr>
+        <w:tabs>
+          <w:tab w:val="num" w:pos="2880"/>
+        </w:tabs>
+        <w:ind w:left="2880" w:hanging="360"/>
+      </w:pPr>
+      <w:rPr>
+        <w:rFonts w:ascii="Wingdings" w:hAnsi="Wingdings" w:hint="default"/>
+        <w:sz w:val="20"/>
+      </w:rPr>
+    </w:lvl>
+    <w:lvl w:ilvl="4" w:tentative="1">
+      <w:start w:val="1"/>
+      <w:numFmt w:val="bullet"/>
+      <w:lvlText w:val=""/>
+      <w:lvlJc w:val="left"/>
+      <w:pPr>
+        <w:tabs>
+          <w:tab w:val="num" w:pos="3600"/>
+        </w:tabs>
+        <w:ind w:left="3600" w:hanging="360"/>
+      </w:pPr>
+      <w:rPr>
+        <w:rFonts w:ascii="Wingdings" w:hAnsi="Wingdings" w:hint="default"/>
+        <w:sz w:val="20"/>
+      </w:rPr>
+    </w:lvl>
+    <w:lvl w:ilvl="5" w:tentative="1">
+      <w:start w:val="1"/>
+      <w:numFmt w:val="bullet"/>
+      <w:lvlText w:val=""/>
+      <w:lvlJc w:val="left"/>
+      <w:pPr>
+        <w:tabs>
+          <w:tab w:val="num" w:pos="4320"/>
+        </w:tabs>
+        <w:ind w:left="4320" w:hanging="360"/>
+      </w:pPr>
+      <w:rPr>
+        <w:rFonts w:ascii="Wingdings" w:hAnsi="Wingdings" w:hint="default"/>
+        <w:sz w:val="20"/>
+      </w:rPr>
+    </w:lvl>
+    <w:lvl w:ilvl="6" w:tentative="1">
+      <w:start w:val="1"/>
+      <w:numFmt w:val="bullet"/>
+      <w:lvlText w:val=""/>
+      <w:lvlJc w:val="left"/>
+      <w:pPr>
+        <w:tabs>
+          <w:tab w:val="num" w:pos="5040"/>
+        </w:tabs>
+        <w:ind w:left="5040" w:hanging="360"/>
+      </w:pPr>
+      <w:rPr>
+        <w:rFonts w:ascii="Wingdings" w:hAnsi="Wingdings" w:hint="default"/>
+        <w:sz w:val="20"/>
+      </w:rPr>
+    </w:lvl>
+    <w:lvl w:ilvl="7" w:tentative="1">
+      <w:start w:val="1"/>
+      <w:numFmt w:val="bullet"/>
+      <w:lvlText w:val=""/>
+      <w:lvlJc w:val="left"/>
+      <w:pPr>
+        <w:tabs>
+          <w:tab w:val="num" w:pos="5760"/>
+        </w:tabs>
+        <w:ind w:left="5760" w:hanging="360"/>
+      </w:pPr>
+      <w:rPr>
+        <w:rFonts w:ascii="Wingdings" w:hAnsi="Wingdings" w:hint="default"/>
+        <w:sz w:val="20"/>
+      </w:rPr>
+    </w:lvl>
+    <w:lvl w:ilvl="8" w:tentative="1">
+      <w:start w:val="1"/>
+      <w:numFmt w:val="bullet"/>
+      <w:lvlText w:val=""/>
+      <w:lvlJc w:val="left"/>
+      <w:pPr>
+        <w:tabs>
+          <w:tab w:val="num" w:pos="6480"/>
+        </w:tabs>
+        <w:ind w:left="6480" w:hanging="360"/>
+      </w:pPr>
+      <w:rPr>
+        <w:rFonts w:ascii="Wingdings" w:hAnsi="Wingdings" w:hint="default"/>
+        <w:sz w:val="20"/>
+      </w:rPr>
+    </w:lvl>
+  </w:abstractNum>
+  <w:abstractNum w:abstractNumId="5" w15:restartNumberingAfterBreak="0">
     <w:nsid w:val="6ACE3539"/>
     <w:multiLevelType w:val="multilevel"/>
     <w:tmpl w:val="2DF0A5C0"/>
@@ -1922,6 +2144,9 @@
     <w:abstractNumId w:val="2"/>
   </w:num>
   <w:num w:numId="5" w16cid:durableId="271131393">
+    <w:abstractNumId w:val="5"/>
+  </w:num>
+  <w:num w:numId="6" w16cid:durableId="1023634398">
     <w:abstractNumId w:val="4"/>
   </w:num>
 </w:numbering>

</xml_diff>